<commit_message>
docs: revise TC-06 onto real days; Phase 8 complete
TC-06's original setup (2 overtime hours on a day with no regular
hours, 2 night hours that were not overtime, gross 2,932.50) cannot
arise from this system's data, so it was revised with the team onto
days the system produces: special day, ordinary days, overtime with a
night portion, rest day and regular holiday, for a gross of 5,141.25,
with itemised deductions and approval. Written into both STD.md and
STD.docx, with a revision note, and the section 4 note now reflects
that all six cases have their modules.

TASKS.md marks Phase 8 complete (~80% overall). CLAUDE.md's STD entry
is updated to match.
</commit_message>
<xml_diff>
--- a/docs/STD.docx
+++ b/docs/STD.docx
@@ -7665,7 +7665,7 @@
                 <w:sz w:val="24"/>
                 <w:szCs w:val="24"/>
               </w:rPr>
-              <w:t xml:space="preserve">To verify that the payroll engine applies the Philippine Labor Code premium rates used by this system — overtime at 1.25x, night differential at 1.10x, rest day at 1.30x, and regular holiday at 2.00x — and that the computed gross pay matches a manual calculation.</w:t>
+              <w:t>To verify that the payroll engine applies the Philippine Labor Code premium rates used by this system — regular day 1.00x, overtime 1.25x on an ordinary day, night differential 1.10x of the applicable rate, rest day 1.30x, special non-working day 1.30x, and regular holiday 2.00x — that premiums compound in the order day type, then overtime, then night differential, and that the computed gross pay matches a manual calculation.</w:t>
             </w:r>
           </w:p>
         </w:tc>
@@ -7791,7 +7791,7 @@
                 <w:sz w:val="24"/>
                 <w:szCs w:val="24"/>
               </w:rPr>
-              <w:t xml:space="preserve">PayrollEngine, RateCalculator, Payroll Run web screen, tbl_attendance, tbl_payroll, tbl_payroll_detail</w:t>
+              <w:t>PayrollEngine, RateCalculator, TimeWorked, StatutoryDeductions, Payroll Run web screen, holiday calendar, tbl_attendance, tbl_overtime_request, tbl_payroll, tbl_payroll_detail</w:t>
             </w:r>
           </w:p>
         </w:tc>
@@ -7854,7 +7854,7 @@
                 <w:sz w:val="24"/>
                 <w:szCs w:val="24"/>
               </w:rPr>
-              <w:t xml:space="preserve">One employee with a daily_rate of ₱600.00, equivalent to ₱75.00 per hour over an eight-hour day. Within a single pay period, verified and synced attendance records for: 8 regular hours; 2 overtime hours on a regular day; 2 night differential hours worked between 10:00 PM and midnight; 8 hours worked on a rest day; and 8 hours worked on a declared regular holiday. Each premium is exercised on a separate day so that the multipliers can be verified independently.</w:t>
+              <w:t>One employee with a daily_rate of ₱600.00, equivalent to ₱75.00 per hour over an eight-hour day, on a deployed crew. Pay period 2026-09-A (21 August – 5 September 2026). Holiday calendar: 21 August 2026, Ninoy Aquino Day (special non-working day), and 31 August 2026, National Heroes Day (regular holiday). Sunday is the rest day. Verified and synced roll call marks the employee Present on Friday 21 August, Monday 24 August, Tuesday 25 August, Wednesday 26 August, Sunday 30 August and Monday 31 August, and Absent on every other working day of the period. Approved overtime requests: Tuesday 25 August, 4:00 PM – 6:00 PM, and Wednesday 26 August, 8:00 PM – midnight.</w:t>
             </w:r>
           </w:p>
         </w:tc>
@@ -7917,79 +7917,97 @@
                 <w:sz w:val="24"/>
                 <w:szCs w:val="24"/>
               </w:rPr>
-              <w:t xml:space="preserve">1. Confirm that all attendance rows for the period carry verified = true and are synced.</w:t>
-            </w:r>
-          </w:p>
-          <w:p>
-            <w:pPr>
-              <w:spacing w:after="60" w:line="300"/>
-              <w:jc w:val="left"/>
-            </w:pPr>
-            <w:r>
-              <w:rPr>
-                <w:rFonts w:ascii="Tahoma" w:cs="Tahoma" w:eastAsia="Tahoma" w:hAnsi="Tahoma"/>
-                <w:b w:val="false"/>
-                <w:bCs w:val="false"/>
-                <w:i w:val="false"/>
-                <w:iCs w:val="false"/>
-                <w:sz w:val="24"/>
-                <w:szCs w:val="24"/>
-              </w:rPr>
-              <w:t xml:space="preserve">2. Open the Payroll Run screen and run payroll for the pay period.</w:t>
-            </w:r>
-          </w:p>
-          <w:p>
-            <w:pPr>
-              <w:spacing w:after="60" w:line="300"/>
-              <w:jc w:val="left"/>
-            </w:pPr>
-            <w:r>
-              <w:rPr>
-                <w:rFonts w:ascii="Tahoma" w:cs="Tahoma" w:eastAsia="Tahoma" w:hAnsi="Tahoma"/>
-                <w:b w:val="false"/>
-                <w:bCs w:val="false"/>
-                <w:i w:val="false"/>
-                <w:iCs w:val="false"/>
-                <w:sz w:val="24"/>
-                <w:szCs w:val="24"/>
-              </w:rPr>
-              <w:t xml:space="preserve">3. Inspect tbl_payroll_detail and confirm the hour buckets: regular_hours = 8, overtime_hours = 2, night_diff_hours = 2, rest_day_hours = 8, holiday_hours = 8.</w:t>
-            </w:r>
-          </w:p>
-          <w:p>
-            <w:pPr>
-              <w:spacing w:after="60" w:line="300"/>
-              <w:jc w:val="left"/>
-            </w:pPr>
-            <w:r>
-              <w:rPr>
-                <w:rFonts w:ascii="Tahoma" w:cs="Tahoma" w:eastAsia="Tahoma" w:hAnsi="Tahoma"/>
-                <w:b w:val="false"/>
-                <w:bCs w:val="false"/>
-                <w:i w:val="false"/>
-                <w:iCs w:val="false"/>
-                <w:sz w:val="24"/>
-                <w:szCs w:val="24"/>
-              </w:rPr>
-              <w:t xml:space="preserve">4. Compare the computed gross pay against the manual calculation.</w:t>
-            </w:r>
-          </w:p>
-          <w:p>
-            <w:pPr>
-              <w:spacing w:after="60" w:line="300"/>
-              <w:jc w:val="left"/>
-            </w:pPr>
-            <w:r>
-              <w:rPr>
-                <w:rFonts w:ascii="Tahoma" w:cs="Tahoma" w:eastAsia="Tahoma" w:hAnsi="Tahoma"/>
-                <w:b w:val="false"/>
-                <w:bCs w:val="false"/>
-                <w:i w:val="false"/>
-                <w:iCs w:val="false"/>
-                <w:sz w:val="24"/>
-                <w:szCs w:val="24"/>
-              </w:rPr>
-              <w:t xml:space="preserve">5. Verify that deductions are applied and that net pay equals gross pay less deductions.</w:t>
+              <w:t>1. Confirm that the period's attendance rows carry verified = true and are synced, and that both overtime requests are approved.</w:t>
+            </w:r>
+          </w:p>
+          <w:p>
+            <w:pPr>
+              <w:spacing w:after="60" w:line="300"/>
+              <w:jc w:val="left"/>
+            </w:pPr>
+            <w:r>
+              <w:rPr>
+                <w:rFonts w:ascii="Tahoma" w:cs="Tahoma" w:eastAsia="Tahoma" w:hAnsi="Tahoma"/>
+                <w:b w:val="false"/>
+                <w:bCs w:val="false"/>
+                <w:i w:val="false"/>
+                <w:iCs w:val="false"/>
+                <w:sz w:val="24"/>
+                <w:szCs w:val="24"/>
+              </w:rPr>
+              <w:t>2. Open the Payroll Run screen, select cut-off 2026-09-A, and compute payroll.</w:t>
+            </w:r>
+          </w:p>
+          <w:p>
+            <w:pPr>
+              <w:spacing w:after="60" w:line="300"/>
+              <w:jc w:val="left"/>
+            </w:pPr>
+            <w:r>
+              <w:rPr>
+                <w:rFonts w:ascii="Tahoma" w:cs="Tahoma" w:eastAsia="Tahoma" w:hAnsi="Tahoma"/>
+                <w:b w:val="false"/>
+                <w:bCs w:val="false"/>
+                <w:i w:val="false"/>
+                <w:iCs w:val="false"/>
+                <w:sz w:val="24"/>
+                <w:szCs w:val="24"/>
+              </w:rPr>
+              <w:t>3. Open the employee's payslip and inspect tbl_payroll_detail; confirm the hour buckets: regular_hours = 24, overtime_hours = 6, night_diff_hours = 2, rest_day_hours = 8, holiday_hours = 16.</w:t>
+            </w:r>
+          </w:p>
+          <w:p>
+            <w:pPr>
+              <w:spacing w:after="60" w:line="300"/>
+              <w:jc w:val="left"/>
+            </w:pPr>
+            <w:r>
+              <w:rPr>
+                <w:rFonts w:ascii="Tahoma" w:cs="Tahoma" w:eastAsia="Tahoma" w:hAnsi="Tahoma"/>
+                <w:b w:val="false"/>
+                <w:bCs w:val="false"/>
+                <w:i w:val="false"/>
+                <w:iCs w:val="false"/>
+                <w:sz w:val="24"/>
+                <w:szCs w:val="24"/>
+              </w:rPr>
+              <w:t>4. Compare the computed gross pay against the manual calculation.</w:t>
+            </w:r>
+          </w:p>
+          <w:p>
+            <w:pPr>
+              <w:spacing w:after="60" w:line="300"/>
+              <w:jc w:val="left"/>
+            </w:pPr>
+            <w:r>
+              <w:rPr>
+                <w:rFonts w:ascii="Tahoma" w:cs="Tahoma" w:eastAsia="Tahoma" w:hAnsi="Tahoma"/>
+                <w:b w:val="false"/>
+                <w:bCs w:val="false"/>
+                <w:i w:val="false"/>
+                <w:iCs w:val="false"/>
+                <w:sz w:val="24"/>
+                <w:szCs w:val="24"/>
+              </w:rPr>
+              <w:t>5. Verify that SSS, PhilHealth, Pag-IBIG and withholding tax are each shown separately and that net pay equals gross pay less their sum.</w:t>
+            </w:r>
+          </w:p>
+          <w:p>
+            <w:pPr>
+              <w:spacing w:after="60" w:line="300"/>
+              <w:jc w:val="left"/>
+            </w:pPr>
+            <w:r>
+              <w:rPr>
+                <w:rFonts w:ascii="Tahoma" w:cs="Tahoma" w:eastAsia="Tahoma" w:hAnsi="Tahoma"/>
+                <w:b w:val="false"/>
+                <w:bCs w:val="false"/>
+                <w:i w:val="false"/>
+                <w:iCs w:val="false"/>
+                <w:sz w:val="24"/>
+                <w:szCs w:val="24"/>
+              </w:rPr>
+              <w:t>6. Confirm that the row remains Draft, then approve it.</w:t>
             </w:r>
           </w:p>
         </w:tc>
@@ -8052,115 +8070,133 @@
                 <w:sz w:val="24"/>
                 <w:szCs w:val="24"/>
               </w:rPr>
-              <w:t xml:space="preserve">The hour buckets match those listed above, and each premium computes as:</w:t>
-            </w:r>
-          </w:p>
-          <w:p>
-            <w:pPr>
-              <w:spacing w:after="60" w:line="300"/>
-              <w:jc w:val="left"/>
-            </w:pPr>
-            <w:r>
-              <w:rPr>
-                <w:rFonts w:ascii="Tahoma" w:cs="Tahoma" w:eastAsia="Tahoma" w:hAnsi="Tahoma"/>
-                <w:b w:val="false"/>
-                <w:bCs w:val="false"/>
-                <w:i w:val="false"/>
-                <w:iCs w:val="false"/>
-                <w:sz w:val="24"/>
-                <w:szCs w:val="24"/>
-              </w:rPr>
-              <w:t xml:space="preserve">Regular: 8 × ₱75.00 = ₱600.00</w:t>
-            </w:r>
-          </w:p>
-          <w:p>
-            <w:pPr>
-              <w:spacing w:after="60" w:line="300"/>
-              <w:jc w:val="left"/>
-            </w:pPr>
-            <w:r>
-              <w:rPr>
-                <w:rFonts w:ascii="Tahoma" w:cs="Tahoma" w:eastAsia="Tahoma" w:hAnsi="Tahoma"/>
-                <w:b w:val="false"/>
-                <w:bCs w:val="false"/>
-                <w:i w:val="false"/>
-                <w:iCs w:val="false"/>
-                <w:sz w:val="24"/>
-                <w:szCs w:val="24"/>
-              </w:rPr>
-              <w:t xml:space="preserve">Overtime: 2 × ₱75.00 × 1.25 = ₱187.50</w:t>
-            </w:r>
-          </w:p>
-          <w:p>
-            <w:pPr>
-              <w:spacing w:after="60" w:line="300"/>
-              <w:jc w:val="left"/>
-            </w:pPr>
-            <w:r>
-              <w:rPr>
-                <w:rFonts w:ascii="Tahoma" w:cs="Tahoma" w:eastAsia="Tahoma" w:hAnsi="Tahoma"/>
-                <w:b w:val="false"/>
-                <w:bCs w:val="false"/>
-                <w:i w:val="false"/>
-                <w:iCs w:val="false"/>
-                <w:sz w:val="24"/>
-                <w:szCs w:val="24"/>
-              </w:rPr>
-              <w:t xml:space="preserve">Night differential: 2 × ₱75.00 × 1.10 = ₱165.00</w:t>
-            </w:r>
-          </w:p>
-          <w:p>
-            <w:pPr>
-              <w:spacing w:after="60" w:line="300"/>
-              <w:jc w:val="left"/>
-            </w:pPr>
-            <w:r>
-              <w:rPr>
-                <w:rFonts w:ascii="Tahoma" w:cs="Tahoma" w:eastAsia="Tahoma" w:hAnsi="Tahoma"/>
-                <w:b w:val="false"/>
-                <w:bCs w:val="false"/>
-                <w:i w:val="false"/>
-                <w:iCs w:val="false"/>
-                <w:sz w:val="24"/>
-                <w:szCs w:val="24"/>
-              </w:rPr>
-              <w:t xml:space="preserve">Rest day: 8 × ₱75.00 × 1.30 = ₱780.00</w:t>
-            </w:r>
-          </w:p>
-          <w:p>
-            <w:pPr>
-              <w:spacing w:after="60" w:line="300"/>
-              <w:jc w:val="left"/>
-            </w:pPr>
-            <w:r>
-              <w:rPr>
-                <w:rFonts w:ascii="Tahoma" w:cs="Tahoma" w:eastAsia="Tahoma" w:hAnsi="Tahoma"/>
-                <w:b w:val="false"/>
-                <w:bCs w:val="false"/>
-                <w:i w:val="false"/>
-                <w:iCs w:val="false"/>
-                <w:sz w:val="24"/>
-                <w:szCs w:val="24"/>
-              </w:rPr>
-              <w:t xml:space="preserve">Regular holiday: 8 × ₱75.00 × 2.00 = ₱1,200.00</w:t>
-            </w:r>
-          </w:p>
-          <w:p>
-            <w:pPr>
-              <w:spacing w:after="60" w:line="300"/>
-              <w:jc w:val="left"/>
-            </w:pPr>
-            <w:r>
-              <w:rPr>
-                <w:rFonts w:ascii="Tahoma" w:cs="Tahoma" w:eastAsia="Tahoma" w:hAnsi="Tahoma"/>
-                <w:b w:val="false"/>
-                <w:bCs w:val="false"/>
-                <w:i w:val="false"/>
-                <w:iCs w:val="false"/>
-                <w:sz w:val="24"/>
-                <w:szCs w:val="24"/>
-              </w:rPr>
-              <w:t xml:space="preserve">Computed gross pay is ₱2,932.50, matching the manual calculation to the centavo. tbl_payroll.status remains Draft until explicitly approved, and net pay equals gross pay less the applied deductions.</w:t>
+              <w:t>The hour buckets match those listed above, and each day computes as:</w:t>
+            </w:r>
+          </w:p>
+          <w:p>
+            <w:pPr>
+              <w:spacing w:after="60" w:line="300"/>
+              <w:jc w:val="left"/>
+            </w:pPr>
+            <w:r>
+              <w:rPr>
+                <w:rFonts w:ascii="Tahoma" w:cs="Tahoma" w:eastAsia="Tahoma" w:hAnsi="Tahoma"/>
+                <w:b w:val="false"/>
+                <w:bCs w:val="false"/>
+                <w:i w:val="false"/>
+                <w:iCs w:val="false"/>
+                <w:sz w:val="24"/>
+                <w:szCs w:val="24"/>
+              </w:rPr>
+              <w:t>Fri 21 Aug, special day: 8 × ₱75.00 × 1.30 = ₱780.00</w:t>
+            </w:r>
+          </w:p>
+          <w:p>
+            <w:pPr>
+              <w:spacing w:after="60" w:line="300"/>
+              <w:jc w:val="left"/>
+            </w:pPr>
+            <w:r>
+              <w:rPr>
+                <w:rFonts w:ascii="Tahoma" w:cs="Tahoma" w:eastAsia="Tahoma" w:hAnsi="Tahoma"/>
+                <w:b w:val="false"/>
+                <w:bCs w:val="false"/>
+                <w:i w:val="false"/>
+                <w:iCs w:val="false"/>
+                <w:sz w:val="24"/>
+                <w:szCs w:val="24"/>
+              </w:rPr>
+              <w:t>Mon 24 Aug, ordinary day: 8 × ₱75.00 = ₱600.00</w:t>
+            </w:r>
+          </w:p>
+          <w:p>
+            <w:pPr>
+              <w:spacing w:after="60" w:line="300"/>
+              <w:jc w:val="left"/>
+            </w:pPr>
+            <w:r>
+              <w:rPr>
+                <w:rFonts w:ascii="Tahoma" w:cs="Tahoma" w:eastAsia="Tahoma" w:hAnsi="Tahoma"/>
+                <w:b w:val="false"/>
+                <w:bCs w:val="false"/>
+                <w:i w:val="false"/>
+                <w:iCs w:val="false"/>
+                <w:sz w:val="24"/>
+                <w:szCs w:val="24"/>
+              </w:rPr>
+              <w:t>Tue 25 Aug: ₱600.00 + overtime 2 × ₱75.00 × 1.25 = ₱787.50</w:t>
+            </w:r>
+          </w:p>
+          <w:p>
+            <w:pPr>
+              <w:spacing w:after="60" w:line="300"/>
+              <w:jc w:val="left"/>
+            </w:pPr>
+            <w:r>
+              <w:rPr>
+                <w:rFonts w:ascii="Tahoma" w:cs="Tahoma" w:eastAsia="Tahoma" w:hAnsi="Tahoma"/>
+                <w:b w:val="false"/>
+                <w:bCs w:val="false"/>
+                <w:i w:val="false"/>
+                <w:iCs w:val="false"/>
+                <w:sz w:val="24"/>
+                <w:szCs w:val="24"/>
+              </w:rPr>
+              <w:t>Wed 26 Aug: ₱600.00 + overtime 8:00 – 10:00 PM, 2 × ₱75.00 × 1.25 = ₱187.50 + night overtime 10:00 PM – midnight, 2 × ₱75.00 × 1.25 × 1.10 = ₱206.25; total ₱993.75</w:t>
+            </w:r>
+          </w:p>
+          <w:p>
+            <w:pPr>
+              <w:spacing w:after="60" w:line="300"/>
+              <w:jc w:val="left"/>
+            </w:pPr>
+            <w:r>
+              <w:rPr>
+                <w:rFonts w:ascii="Tahoma" w:cs="Tahoma" w:eastAsia="Tahoma" w:hAnsi="Tahoma"/>
+                <w:b w:val="false"/>
+                <w:bCs w:val="false"/>
+                <w:i w:val="false"/>
+                <w:iCs w:val="false"/>
+                <w:sz w:val="24"/>
+                <w:szCs w:val="24"/>
+              </w:rPr>
+              <w:t>Sun 30 Aug, rest day: 8 × ₱75.00 × 1.30 = ₱780.00</w:t>
+            </w:r>
+          </w:p>
+          <w:p>
+            <w:pPr>
+              <w:spacing w:after="60" w:line="300"/>
+              <w:jc w:val="left"/>
+            </w:pPr>
+            <w:r>
+              <w:rPr>
+                <w:rFonts w:ascii="Tahoma" w:cs="Tahoma" w:eastAsia="Tahoma" w:hAnsi="Tahoma"/>
+                <w:b w:val="false"/>
+                <w:bCs w:val="false"/>
+                <w:i w:val="false"/>
+                <w:iCs w:val="false"/>
+                <w:sz w:val="24"/>
+                <w:szCs w:val="24"/>
+              </w:rPr>
+              <w:t>Mon 31 Aug, regular holiday: 8 × ₱75.00 × 2.00 = ₱1,200.00</w:t>
+            </w:r>
+          </w:p>
+          <w:p>
+            <w:pPr>
+              <w:spacing w:after="60" w:line="300"/>
+              <w:jc w:val="left"/>
+            </w:pPr>
+            <w:r>
+              <w:rPr>
+                <w:rFonts w:ascii="Tahoma" w:cs="Tahoma" w:eastAsia="Tahoma" w:hAnsi="Tahoma"/>
+                <w:b w:val="false"/>
+                <w:bCs w:val="false"/>
+                <w:i w:val="false"/>
+                <w:iCs w:val="false"/>
+                <w:sz w:val="24"/>
+                <w:szCs w:val="24"/>
+              </w:rPr>
+              <w:t>Computed gross pay is ₱5,141.25, matching the manual calculation to the centavo. tbl_payroll.status remains Draft until explicitly approved, each statutory deduction is itemised with a note stating why withholding tax is or is not due, and net pay equals gross pay less the itemised deductions.</w:t>
             </w:r>
           </w:p>
         </w:tc>
@@ -8371,6 +8407,24 @@
           <w:szCs w:val="24"/>
         </w:rPr>
         <w:t xml:space="preserve">Table 8.0 TC-06 Holiday Payroll Computation Test Case</w:t>
+      </w:r>
+    </w:p>
+    <w:p>
+      <w:pPr>
+        <w:spacing w:after="160" w:line="360"/>
+        <w:jc w:val="both"/>
+      </w:pPr>
+      <w:r>
+        <w:rPr>
+          <w:rFonts w:ascii="Tahoma" w:cs="Tahoma" w:eastAsia="Tahoma" w:hAnsi="Tahoma"/>
+          <w:b w:val="false"/>
+          <w:bCs w:val="false"/>
+          <w:i/>
+          <w:iCs/>
+          <w:sz w:val="24"/>
+          <w:szCs w:val="24"/>
+        </w:rPr>
+        <w:t>Revision (18 September 2026, agreed with the team): the original TC-06 setup — two overtime hours on a day with no regular hours, and two night hours that were not overtime, for a gross of ₱2,932.50 — cannot arise from this system's data. Roll call records each worker's arrival on a fixed 7:00 AM shift, and overtime, including night work, is paid only from approved overtime requests. The revised setup uses days the system actually produces, keeps every multiplier under test, and adds the special non-working day and the compounding of overtime and night differential.</w:t>
       </w:r>
     </w:p>
     <w:p>
@@ -9332,7 +9386,7 @@
           <w:sz w:val="24"/>
           <w:szCs w:val="24"/>
         </w:rPr>
-        <w:t xml:space="preserve">Note: TC-01, TC-02, and TC-03 exercise the Cryptographic Attendance Integrity Engine, and TC-06 exercises the Payroll Engine. Both are scheduled for later development phases, so these four cases are specified here in advance and are to be executed once those modules are implemented. TC-04 and TC-05 depend on the Foreman Edge Case Handling module.</w:t>
+        <w:t>Note: TC-01, TC-02, and TC-03 exercise the Cryptographic Attendance Integrity Engine (Phase 5), TC-04 and TC-05 the Foreman Edge Case Handling module (Phase 7), and TC-06 the Payroll Engine (Phase 8). All six modules are now implemented and each case is covered by automated tests; the manual executions recorded in Actual Result and Pass/Fail are still to be carried out.</w:t>
       </w:r>
     </w:p>
     <w:sectPr>

</xml_diff>

<commit_message>
docs(std): pre-run expected results match the built engine; host test command
TC-02/03/04/05 expected results predate the engine and describe unbuilt behaviour: rejected records are never stored (evidence is the ATTENDANCE_VERIFICATION_FAILED row with reason, no verified=false marker); an edited payload fails HMAC before any signature check; the test net is plain HTTP; override_flag holds shift_credit; cover history is regular_foreman_id/acting_until + audit, with stood-down-foreman roll calls refused as not_crew_foreman. TC-03 procedure is now the three-copy holdback + optional replay. Dated September revision note next to TC-06's, in .md and .docx — before the manual run, not after.

TC-02's SQLCipher setup line stands only under decision A. TASKS.md:9 now points at the host runner (39 s vs 452 s in-container, measured).
</commit_message>
<xml_diff>
--- a/docs/STD.docx
+++ b/docs/STD.docx
@@ -3923,21 +3923,8 @@
             <w:vAlign w:val="center"/>
           </w:tcPr>
           <w:p>
-            <w:pPr>
-              <w:spacing w:after="60" w:line="300"/>
-              <w:jc w:val="left"/>
-            </w:pPr>
-            <w:r>
-              <w:rPr>
-                <w:rFonts w:ascii="Tahoma" w:cs="Tahoma" w:eastAsia="Tahoma" w:hAnsi="Tahoma"/>
-                <w:b w:val="false"/>
-                <w:bCs w:val="false"/>
-                <w:i w:val="false"/>
-                <w:iCs w:val="false"/>
-                <w:sz w:val="24"/>
-                <w:szCs w:val="24"/>
-              </w:rPr>
-              <w:t xml:space="preserve">The monotonic counter is unaffected by the wall-clock change, so Worker B's monotonic_timestamp is strictly greater than Worker A's. The server detects that the wall-clock time_in regressed while the monotonic counter advanced, rejects or flags Worker B's record rather than trusting the rolled-back time, records verified = false in the signature ledger, and writes an entry to tbl_audit_log. The hash chain remains continuous and no falsified time is committed as the effective attendance time.</w:t>
+            <w:r>
+              <w:t>The HMAC recomputed over row 2's payload no longer matches its stored hmac_hash, and the linkage from row 2 to row 3 is broken. The server accepts row 1 and rejects row 2 (hmac_mismatch) and row 3 (chain_broken_upstream). Rejected records are never stored: there is no attendances row and no verified = false marker for either — the evidence is an ATTENDANCE_VERIFICATION_FAILED audit row carrying each reason, and the server's chain tip does not move. No tampered value is committed to tbl_attendance. The phone then stops syncing until it is re-bound.</w:t>
             </w:r>
           </w:p>
         </w:tc>
@@ -5164,21 +5151,8 @@
             <w:vAlign w:val="center"/>
           </w:tcPr>
           <w:p>
-            <w:pPr>
-              <w:spacing w:after="60" w:line="300"/>
-              <w:jc w:val="left"/>
-            </w:pPr>
-            <w:r>
-              <w:rPr>
-                <w:rFonts w:ascii="Tahoma" w:cs="Tahoma" w:eastAsia="Tahoma" w:hAnsi="Tahoma"/>
-                <w:b w:val="false"/>
-                <w:bCs w:val="false"/>
-                <w:i w:val="false"/>
-                <w:iCs w:val="false"/>
-                <w:sz w:val="24"/>
-                <w:szCs w:val="24"/>
-              </w:rPr>
-              <w:t xml:space="preserve">To verify that an attendance payload altered in transit fails ECDSA P-256 signature verification, and that a signature produced outside the device's Trusted Execution Environment is not accepted.</w:t>
+            <w:r>
+              <w:t>To verify that an attendance payload altered in transit is rejected first at the HMAC layer and then at the signature layer, and that a signature produced outside the device's Trusted Execution Environment is not accepted.</w:t>
             </w:r>
           </w:p>
         </w:tc>
@@ -5290,21 +5264,8 @@
             <w:vAlign w:val="center"/>
           </w:tcPr>
           <w:p>
-            <w:pPr>
-              <w:spacing w:after="60" w:line="300"/>
-              <w:jc w:val="left"/>
-            </w:pPr>
-            <w:r>
-              <w:rPr>
-                <w:rFonts w:ascii="Tahoma" w:cs="Tahoma" w:eastAsia="Tahoma" w:hAnsi="Tahoma"/>
-                <w:b w:val="false"/>
-                <w:bCs w:val="false"/>
-                <w:i w:val="false"/>
-                <w:iCs w:val="false"/>
-                <w:sz w:val="24"/>
-                <w:szCs w:val="24"/>
-              </w:rPr>
-              <w:t xml:space="preserve">TEESigner (Android Keystore), Laravel SignatureVerifier, intercepting HTTPS proxy, tbl_crypto_signature, tbl_audit_log</w:t>
+            <w:r>
+              <w:t>TEESigner (Android Keystore), Laravel SignatureVerifier, intercepting HTTP proxy on the plain LAN (the release build allows cleartext HTTP for now), tbl_crypto_signature, tbl_audit_log</w:t>
             </w:r>
           </w:p>
         </w:tc>
@@ -5353,21 +5314,8 @@
             <w:vAlign w:val="center"/>
           </w:tcPr>
           <w:p>
-            <w:pPr>
-              <w:spacing w:after="60" w:line="300"/>
-              <w:jc w:val="left"/>
-            </w:pPr>
-            <w:r>
-              <w:rPr>
-                <w:rFonts w:ascii="Tahoma" w:cs="Tahoma" w:eastAsia="Tahoma" w:hAnsi="Tahoma"/>
-                <w:b w:val="false"/>
-                <w:bCs w:val="false"/>
-                <w:i w:val="false"/>
-                <w:iCs w:val="false"/>
-                <w:sz w:val="24"/>
-                <w:szCs w:val="24"/>
-              </w:rPr>
-              <w:t xml:space="preserve">Device bound to the system with a keypair generated inside the TEE, whose public key is registered on the server. The proxy's certificate authority is trusted on the test device for the duration of this test only, so that HTTPS traffic can be intercepted.</w:t>
+            <w:r>
+              <w:t>Device bound to the system with a keypair generated inside the TEE, whose public key is registered on the server. The test phones and the laptop share one Wi-Fi network; traffic is intercepted on plain HTTP for the duration of this test only.</w:t>
             </w:r>
           </w:p>
         </w:tc>
@@ -5416,93 +5364,8 @@
             <w:vAlign w:val="center"/>
           </w:tcPr>
           <w:p>
-            <w:pPr>
-              <w:spacing w:after="60" w:line="300"/>
-              <w:jc w:val="left"/>
-            </w:pPr>
-            <w:r>
-              <w:rPr>
-                <w:rFonts w:ascii="Tahoma" w:cs="Tahoma" w:eastAsia="Tahoma" w:hAnsi="Tahoma"/>
-                <w:b w:val="false"/>
-                <w:bCs w:val="false"/>
-                <w:i w:val="false"/>
-                <w:iCs w:val="false"/>
-                <w:sz w:val="24"/>
-                <w:szCs w:val="24"/>
-              </w:rPr>
-              <w:t xml:space="preserve">1. Record an attendance entry and allow synchronization to begin.</w:t>
-            </w:r>
-          </w:p>
-          <w:p>
-            <w:pPr>
-              <w:spacing w:after="60" w:line="300"/>
-              <w:jc w:val="left"/>
-            </w:pPr>
-            <w:r>
-              <w:rPr>
-                <w:rFonts w:ascii="Tahoma" w:cs="Tahoma" w:eastAsia="Tahoma" w:hAnsi="Tahoma"/>
-                <w:b w:val="false"/>
-                <w:bCs w:val="false"/>
-                <w:i w:val="false"/>
-                <w:iCs w:val="false"/>
-                <w:sz w:val="24"/>
-                <w:szCs w:val="24"/>
-              </w:rPr>
-              <w:t xml:space="preserve">2. Intercept the sync request and alter a field in the payload — for example employee_id or time_in — leaving ecdsa_signature unchanged, then forward the request.</w:t>
-            </w:r>
-          </w:p>
-          <w:p>
-            <w:pPr>
-              <w:spacing w:after="60" w:line="300"/>
-              <w:jc w:val="left"/>
-            </w:pPr>
-            <w:r>
-              <w:rPr>
-                <w:rFonts w:ascii="Tahoma" w:cs="Tahoma" w:eastAsia="Tahoma" w:hAnsi="Tahoma"/>
-                <w:b w:val="false"/>
-                <w:bCs w:val="false"/>
-                <w:i w:val="false"/>
-                <w:iCs w:val="false"/>
-                <w:sz w:val="24"/>
-                <w:szCs w:val="24"/>
-              </w:rPr>
-              <w:t xml:space="preserve">3. Observe the API response and the server-side tables.</w:t>
-            </w:r>
-          </w:p>
-          <w:p>
-            <w:pPr>
-              <w:spacing w:after="60" w:line="300"/>
-              <w:jc w:val="left"/>
-            </w:pPr>
-            <w:r>
-              <w:rPr>
-                <w:rFonts w:ascii="Tahoma" w:cs="Tahoma" w:eastAsia="Tahoma" w:hAnsi="Tahoma"/>
-                <w:b w:val="false"/>
-                <w:bCs w:val="false"/>
-                <w:i w:val="false"/>
-                <w:iCs w:val="false"/>
-                <w:sz w:val="24"/>
-                <w:szCs w:val="24"/>
-              </w:rPr>
-              <w:t xml:space="preserve">4. Repeat the interception, this time replacing the signature with one generated from a keypair created outside the TEE.</w:t>
-            </w:r>
-          </w:p>
-          <w:p>
-            <w:pPr>
-              <w:spacing w:after="60" w:line="300"/>
-              <w:jc w:val="left"/>
-            </w:pPr>
-            <w:r>
-              <w:rPr>
-                <w:rFonts w:ascii="Tahoma" w:cs="Tahoma" w:eastAsia="Tahoma" w:hAnsi="Tahoma"/>
-                <w:b w:val="false"/>
-                <w:bCs w:val="false"/>
-                <w:i w:val="false"/>
-                <w:iCs w:val="false"/>
-                <w:sz w:val="24"/>
-                <w:szCs w:val="24"/>
-              </w:rPr>
-              <w:t xml:space="preserve">5. Observe the API response again.</w:t>
+            <w:r>
+              <w:t>1. Record an attendance entry; hold the phone's real sync request back at the proxy, save it, and drop it (the phone retries later). 2. Send three altered copies using the phone's own token: (a) change time_in only; (b) change time_in and recalculate the HMAC with the phone's secret taken from the server, simulating root access on the phone; (c) as (b), plus a valid P-256 signature from a key made on the laptop. A throwaway script may build (b) and (c) with the server's own AttendancePayload::canonicalize and HashChainVerifier::computeHmac, so the only thing wrong with each copy is the thing under test. 3. Turn interception off; the phone's retry goes through and the original entry is accepted. 4. Optionally, send the original again. 5. Inspect the audit log and tbl_attendance.</w:t>
             </w:r>
           </w:p>
         </w:tc>
@@ -5551,21 +5414,8 @@
             <w:vAlign w:val="center"/>
           </w:tcPr>
           <w:p>
-            <w:pPr>
-              <w:spacing w:after="60" w:line="300"/>
-              <w:jc w:val="left"/>
-            </w:pPr>
-            <w:r>
-              <w:rPr>
-                <w:rFonts w:ascii="Tahoma" w:cs="Tahoma" w:eastAsia="Tahoma" w:hAnsi="Tahoma"/>
-                <w:b w:val="false"/>
-                <w:bCs w:val="false"/>
-                <w:i w:val="false"/>
-                <w:iCs w:val="false"/>
-                <w:sz w:val="24"/>
-                <w:szCs w:val="24"/>
-              </w:rPr>
-              <w:t xml:space="preserve">In both attempts the server rejects the record. In the first, the signature no longer matches the modified payload; in the second, the signature does not verify against the registered public key for that device. No row is committed to tbl_attendance, verified = false is recorded, and an audit entry is written for each rejected attempt. The private key is not exportable from the TEE, so a valid signature cannot be produced off-device.</w:t>
+            <w:r>
+              <w:t>All three copies are rejected and no row is stored for any of them: (a) fails the HMAC check (hmac_mismatch) — an edited payload never reaches the signature check unless its HMAC is also recalculated; (b) fails the signature check; (c) fails because the key is not the phone's registered public key. Three ATTENDANCE_VERIFICATION_FAILED audit rows record those reasons. A replayed original is rejected as prev_hash_mismatch, showing replay protection. The phone's own chain survives throughout, so no re-bind is needed.</w:t>
             </w:r>
           </w:p>
         </w:tc>
@@ -6374,21 +6224,8 @@
             <w:vAlign w:val="center"/>
           </w:tcPr>
           <w:p>
-            <w:pPr>
-              <w:spacing w:after="60" w:line="300"/>
-              <w:jc w:val="left"/>
-            </w:pPr>
-            <w:r>
-              <w:rPr>
-                <w:rFonts w:ascii="Tahoma" w:cs="Tahoma" w:eastAsia="Tahoma" w:hAnsi="Tahoma"/>
-                <w:b w:val="false"/>
-                <w:bCs w:val="false"/>
-                <w:i w:val="false"/>
-                <w:iCs w:val="false"/>
-                <w:sz w:val="24"/>
-                <w:szCs w:val="24"/>
-              </w:rPr>
-              <w:t xml:space="preserve">The credited workers' time_in is recorded as 07:00 rather than 09:20, and override_flag is set to true on those rows. One tbl_audit_log entry is written per override with action_type of FOREMAN_LATE_OVERRIDE, the acting foreman as actor_id, and a timestamp reflecting the actual time of the action (09:20), so that the credited time and the real time of entry are both recoverable. The override is visible on the Late Override Audit screen.</w:t>
+            <w:r>
+              <w:t>The credited workers' time_in is recorded as 07:00 rather than 09:20, and override_flag holds shift_credit (the override kind, not a bare boolean) on those rows. One tbl_audit_log entry is written per override with action_type of FOREMAN_LATE_OVERRIDE, the acting foreman as actor_id, and a timestamp reflecting the actual time of the action (09:20), so that the credited time and the real time of entry are both recoverable. The override is visible on the Late Override Audit screen.</w:t>
             </w:r>
           </w:p>
         </w:tc>
@@ -6936,21 +6773,8 @@
             <w:vAlign w:val="center"/>
           </w:tcPr>
           <w:p>
-            <w:pPr>
-              <w:spacing w:after="60" w:line="300"/>
-              <w:jc w:val="left"/>
-            </w:pPr>
-            <w:r>
-              <w:rPr>
-                <w:rFonts w:ascii="Tahoma" w:cs="Tahoma" w:eastAsia="Tahoma" w:hAnsi="Tahoma"/>
-                <w:b w:val="false"/>
-                <w:bCs w:val="false"/>
-                <w:i w:val="false"/>
-                <w:iCs w:val="false"/>
-                <w:sz w:val="24"/>
-                <w:szCs w:val="24"/>
-              </w:rPr>
-              <w:t xml:space="preserve">Acting Foreman Reassignment web screen, crew and foreman-scoped roster API, RBAC policies, Audit Log service, tbl_crew, tbl_crew_assignment, tbl_audit_log</w:t>
+            <w:r>
+              <w:t>Acting Foreman Reassignment web screen, crew and foreman-scoped roster API, RBAC policies, Audit Log service, tbl_crew, tbl_audit_log</w:t>
             </w:r>
           </w:p>
         </w:tc>
@@ -7062,111 +6886,8 @@
             <w:vAlign w:val="center"/>
           </w:tcPr>
           <w:p>
-            <w:pPr>
-              <w:spacing w:after="60" w:line="300"/>
-              <w:jc w:val="left"/>
-            </w:pPr>
-            <w:r>
-              <w:rPr>
-                <w:rFonts w:ascii="Tahoma" w:cs="Tahoma" w:eastAsia="Tahoma" w:hAnsi="Tahoma"/>
-                <w:b w:val="false"/>
-                <w:bCs w:val="false"/>
-                <w:i w:val="false"/>
-                <w:iCs w:val="false"/>
-                <w:sz w:val="24"/>
-                <w:szCs w:val="24"/>
-              </w:rPr>
-              <w:t xml:space="preserve">1. As the Site Engineer, open the Acting Foreman Reassignment screen and select Crew X.</w:t>
-            </w:r>
-          </w:p>
-          <w:p>
-            <w:pPr>
-              <w:spacing w:after="60" w:line="300"/>
-              <w:jc w:val="left"/>
-            </w:pPr>
-            <w:r>
-              <w:rPr>
-                <w:rFonts w:ascii="Tahoma" w:cs="Tahoma" w:eastAsia="Tahoma" w:hAnsi="Tahoma"/>
-                <w:b w:val="false"/>
-                <w:bCs w:val="false"/>
-                <w:i w:val="false"/>
-                <w:iCs w:val="false"/>
-                <w:sz w:val="24"/>
-                <w:szCs w:val="24"/>
-              </w:rPr>
-              <w:t xml:space="preserve">2. Re-assign Crew X to Foreman F2 in a single action.</w:t>
-            </w:r>
-          </w:p>
-          <w:p>
-            <w:pPr>
-              <w:spacing w:after="60" w:line="300"/>
-              <w:jc w:val="left"/>
-            </w:pPr>
-            <w:r>
-              <w:rPr>
-                <w:rFonts w:ascii="Tahoma" w:cs="Tahoma" w:eastAsia="Tahoma" w:hAnsi="Tahoma"/>
-                <w:b w:val="false"/>
-                <w:bCs w:val="false"/>
-                <w:i w:val="false"/>
-                <w:iCs w:val="false"/>
-                <w:sz w:val="24"/>
-                <w:szCs w:val="24"/>
-              </w:rPr>
-              <w:t xml:space="preserve">3. Sign in to the mobile application as F2 and refresh the crew roster.</w:t>
-            </w:r>
-          </w:p>
-          <w:p>
-            <w:pPr>
-              <w:spacing w:after="60" w:line="300"/>
-              <w:jc w:val="left"/>
-            </w:pPr>
-            <w:r>
-              <w:rPr>
-                <w:rFonts w:ascii="Tahoma" w:cs="Tahoma" w:eastAsia="Tahoma" w:hAnsi="Tahoma"/>
-                <w:b w:val="false"/>
-                <w:bCs w:val="false"/>
-                <w:i w:val="false"/>
-                <w:iCs w:val="false"/>
-                <w:sz w:val="24"/>
-                <w:szCs w:val="24"/>
-              </w:rPr>
-              <w:t xml:space="preserve">4. Record roll call for Crew X as F2.</w:t>
-            </w:r>
-          </w:p>
-          <w:p>
-            <w:pPr>
-              <w:spacing w:after="60" w:line="300"/>
-              <w:jc w:val="left"/>
-            </w:pPr>
-            <w:r>
-              <w:rPr>
-                <w:rFonts w:ascii="Tahoma" w:cs="Tahoma" w:eastAsia="Tahoma" w:hAnsi="Tahoma"/>
-                <w:b w:val="false"/>
-                <w:bCs w:val="false"/>
-                <w:i w:val="false"/>
-                <w:iCs w:val="false"/>
-                <w:sz w:val="24"/>
-                <w:szCs w:val="24"/>
-              </w:rPr>
-              <w:t xml:space="preserve">5. Attempt to fetch the roster for and record roll call for Crew X as F1.</w:t>
-            </w:r>
-          </w:p>
-          <w:p>
-            <w:pPr>
-              <w:spacing w:after="60" w:line="300"/>
-              <w:jc w:val="left"/>
-            </w:pPr>
-            <w:r>
-              <w:rPr>
-                <w:rFonts w:ascii="Tahoma" w:cs="Tahoma" w:eastAsia="Tahoma" w:hAnsi="Tahoma"/>
-                <w:b w:val="false"/>
-                <w:bCs w:val="false"/>
-                <w:i w:val="false"/>
-                <w:iCs w:val="false"/>
-                <w:sz w:val="24"/>
-                <w:szCs w:val="24"/>
-              </w:rPr>
-              <w:t xml:space="preserve">6. Review the audit log in the web portal.</w:t>
+            <w:r>
+              <w:t>1. As the Site Engineer, open the Acting Foreman Reassignment screen and select Crew X. 2. Re-assign Crew X to Foreman F2 in a single action. 3. Sign in to the mobile application as F2 and refresh the crew roster. 4. Record roll call for Crew X as F2. 5. Attempt to fetch the roster for Crew X as F1 (it is gone) and submit a Crew X roll call recorded offline as F1. 6. Review the audit log in the web portal.</w:t>
             </w:r>
           </w:p>
         </w:tc>
@@ -7215,21 +6936,8 @@
             <w:vAlign w:val="center"/>
           </w:tcPr>
           <w:p>
-            <w:pPr>
-              <w:spacing w:after="60" w:line="300"/>
-              <w:jc w:val="left"/>
-            </w:pPr>
-            <w:r>
-              <w:rPr>
-                <w:rFonts w:ascii="Tahoma" w:cs="Tahoma" w:eastAsia="Tahoma" w:hAnsi="Tahoma"/>
-                <w:b w:val="false"/>
-                <w:bCs w:val="false"/>
-                <w:i w:val="false"/>
-                <w:iCs w:val="false"/>
-                <w:sz w:val="24"/>
-                <w:szCs w:val="24"/>
-              </w:rPr>
-              <w:t xml:space="preserve">tbl_crew.foreman_id for Crew X is updated to F2. F2's foreman-scoped roster returns Crew X and attendance recorded by F2 is accepted. F1's request for Crew X is refused by the roster policy. A tbl_audit_log entry records the re-assignment with the Site Engineer as actor_id and a timestamp. The prior assignment history is preserved through tbl_crew_assignment.status rather than being deleted, so the change remains auditable.</w:t>
+            <w:r>
+              <w:t>tbl_crew.foreman_id for Crew X is unchanged; the cover is recorded as crews.regular_foreman_id (F1) with crews.acting_until, and a tbl_audit_log entry with action ACTING_FOREMAN_ASSIGNED names the Site Engineer. F2's foreman-scoped roster returns Crew X and attendance recorded by F2 is accepted. F1's roster no longer lists Crew X, and a Crew X roll call F1 submits anyway is refused at sync (not_crew_foreman) without halting the phone. History is the audit entry, not a status column — crew_assignment carries none.</w:t>
             </w:r>
           </w:p>
         </w:tc>
@@ -8425,6 +8133,11 @@
           <w:szCs w:val="24"/>
         </w:rPr>
         <w:t>Revision (18 September 2026, agreed with the team): the original TC-06 setup — two overtime hours on a day with no regular hours, and two night hours that were not overtime, for a gross of ₱2,932.50 — cannot arise from this system's data. Roll call records each worker's arrival on a fixed 7:00 AM shift, and overtime, including night work, is paid only from approved overtime requests. The revised setup uses days the system actually produces, keeps every multiplier under test, and adds the special non-working day and the compounding of overtime and night differential.</w:t>
+      </w:r>
+    </w:p>
+    <w:p>
+      <w:r>
+        <w:t>Revision (September 2026, verified against the implementation before the manual run): the expected results above predate the engine (11 September 2026) and describe several behaviours the system was never built with. Rejected records are never stored — there is no verified = false marker for them; the evidence is an ATTENDANCE_VERIFICATION_FAILED audit row carrying the reason. An edited payload fails the HMAC check before any signature check is reached. The test network is plain HTTP on the LAN, not HTTPS with a trusted proxy CA. override_flag holds shift_credit, not true. Acting-cover history lives in crews.regular_foreman_id / crews.acting_until plus the ACTING_FOREMAN_ASSIGNED audit — not in any crew_assignment status — and a roll call from the stood-down foreman is refused at sync as not_crew_foreman without halting. TC-02's setup line (the SQLCipher key made available to the tester) stands only if SQLCipher is switched on (decision A); under decision B the same steps run with a plain SQLite client.</w:t>
       </w:r>
     </w:p>
     <w:p>

</xml_diff>